<commit_message>
Standardize deliverables section across all 6 workpackage templates (AOT milestone-aligned)
Co-authored-by: piyush-maersk <252132564+piyush-maersk@users.noreply.github.com>
Agent-Logs-Url: https://github.com/piyush-maersk/Workpackage-generation-app/sessions/35d3f6a9-e2c7-45bd-88b9-c81806a21366
</commit_message>
<xml_diff>
--- a/AOT - WorkPackage - Perimeter - Firewall.docx
+++ b/AOT - WorkPackage - Perimeter - Firewall.docx
@@ -2109,219 +2109,81 @@
     <w:p>
       <w:pPr>
         <w:pStyle w:val="Heading3"/>
-        <w:spacing w:before="0" w:after="0"/>
-        <w:rPr>
-          <w:b/>
-          <w:bCs/>
-        </w:rPr>
-      </w:pPr>
-      <w:r>
-        <w:rPr>
-          <w:b/>
-          <w:bCs/>
-        </w:rPr>
-        <w:t xml:space="preserve">4.1 </w:t>
-      </w:r>
-      <w:r>
-        <w:rPr>
-          <w:b/>
-          <w:bCs/>
-        </w:rPr>
-        <w:t>MS1.3 - PROV OF DESIGN</w:t>
+      </w:pPr>
+      <w:r>
+        <w:t>4.1 MS1.3 – Provision of Design &amp; Procurement</w:t>
       </w:r>
     </w:p>
     <w:p>
       <w:pPr>
         <w:pStyle w:val="ListParagraph"/>
-        <w:rPr>
-          <w:rFonts w:ascii="Segoe UI" w:hAnsi="Segoe UI" w:eastAsia="Segoe UI" w:cs="Segoe UI"/>
-          <w:sz w:val="21"/>
-          <w:szCs w:val="21"/>
-        </w:rPr>
-      </w:pPr>
-      <w:r>
-        <w:t>Procurement</w:t>
-      </w:r>
-      <w:r>
-        <w:t>, Design</w:t>
-      </w:r>
-      <w:r>
-        <w:t xml:space="preserve"> and delivery </w:t>
-      </w:r>
-      <w:r>
-        <w:t>work packaged as per</w:t>
-      </w:r>
-      <w:r>
-        <w:t xml:space="preserve"> defined </w:t>
-      </w:r>
-      <w:r>
-        <w:t xml:space="preserve">in Section </w:t>
-      </w:r>
-      <w:r>
-        <w:t>1 to 3</w:t>
+      </w:pPr>
+      <w:r>
+        <w:t>Procurement, design and delivery of all equipment as defined in Sections 1–3</w:t>
       </w:r>
     </w:p>
     <w:p>
       <w:pPr>
         <w:pStyle w:val="ListParagraph"/>
-        <w:rPr>
-          <w:rFonts w:ascii="Segoe UI" w:hAnsi="Segoe UI" w:eastAsia="Segoe UI" w:cs="Segoe UI"/>
-          <w:sz w:val="21"/>
-          <w:szCs w:val="21"/>
-        </w:rPr>
-      </w:pPr>
-      <w:r>
-        <w:t xml:space="preserve">Physical installation </w:t>
-      </w:r>
-      <w:r>
-        <w:t xml:space="preserve">of </w:t>
-      </w:r>
-      <w:r>
-        <w:t>firewall</w:t>
-      </w:r>
-      <w:r>
-        <w:t xml:space="preserve"> in designated locations</w:t>
+      </w:pPr>
+      <w:r>
+        <w:t>Physical installation of equipment in designated locations</w:t>
       </w:r>
     </w:p>
     <w:p>
       <w:pPr>
         <w:pStyle w:val="ListParagraph"/>
-        <w:rPr>
-          <w:rFonts w:ascii="Segoe UI" w:hAnsi="Segoe UI" w:eastAsia="Segoe UI" w:cs="Segoe UI"/>
-          <w:sz w:val="21"/>
-          <w:szCs w:val="21"/>
-        </w:rPr>
-      </w:pPr>
-      <w:r>
-        <w:t>Installation of peripherals, accessories as required</w:t>
+      </w:pPr>
+      <w:r>
+        <w:t>Installation of accessories and peripherals as required</w:t>
       </w:r>
     </w:p>
     <w:p>
       <w:pPr>
-        <w:pStyle w:val="ListParagraph"/>
-        <w:numPr>
-          <w:ilvl w:val="0"/>
-          <w:numId w:val="0"/>
-        </w:numPr>
-        <w:ind w:left="720"/>
-        <w:rPr>
-          <w:rFonts w:ascii="Segoe UI" w:hAnsi="Segoe UI" w:eastAsia="Segoe UI" w:cs="Segoe UI"/>
-          <w:sz w:val="21"/>
-          <w:szCs w:val="21"/>
-        </w:rPr>
-      </w:pPr>
+        <w:pStyle w:val="Heading3"/>
+      </w:pPr>
+      <w:r>
+        <w:t>4.2 MS2 – FAT (Factory Acceptance Testing)</w:t>
+      </w:r>
     </w:p>
     <w:p>
       <w:pPr>
-        <w:pStyle w:val="Heading3"/>
-        <w:spacing w:before="0" w:after="0"/>
-        <w:rPr>
-          <w:b/>
-          <w:bCs/>
-        </w:rPr>
-      </w:pPr>
-      <w:r>
-        <w:rPr>
-          <w:b/>
-          <w:bCs/>
-        </w:rPr>
-        <w:t xml:space="preserve">4.2 </w:t>
-      </w:r>
-      <w:r>
-        <w:rPr>
-          <w:b/>
-          <w:bCs/>
-        </w:rPr>
-        <w:t>MS2 - FAT</w:t>
+        <w:pStyle w:val="ListParagraph"/>
+      </w:pPr>
+      <w:r>
+        <w:t>Factory acceptance testing and verification of all hardware prior to site delivery</w:t>
       </w:r>
     </w:p>
     <w:p>
       <w:pPr>
         <w:pStyle w:val="ListParagraph"/>
-        <w:rPr>
-          <w:b/>
-          <w:bCs/>
-        </w:rPr>
-      </w:pPr>
-      <w:r>
-        <w:t xml:space="preserve">Configuration of </w:t>
-      </w:r>
-      <w:r>
-        <w:t>Firewall</w:t>
-      </w:r>
-      <w:r>
-        <w:t xml:space="preserve"> and Services as per technical requirements</w:t>
-      </w:r>
-      <w:r>
-        <w:t>.</w:t>
+      </w:pPr>
+      <w:r>
+        <w:t>Pre-staging and configuration of equipment as per technical requirements</w:t>
       </w:r>
     </w:p>
     <w:p>
       <w:pPr>
         <w:pStyle w:val="ListParagraph"/>
-        <w:numPr>
-          <w:ilvl w:val="0"/>
-          <w:numId w:val="0"/>
-        </w:numPr>
-        <w:ind w:left="720"/>
-      </w:pPr>
+      </w:pPr>
+      <w:r>
+        <w:t>Confirmation of full Bill of Materials receipt and manufacturer warranty coverage</w:t>
+      </w:r>
     </w:p>
     <w:p>
       <w:pPr>
         <w:pStyle w:val="Heading3"/>
-        <w:spacing w:before="0" w:after="0"/>
-        <w:rPr>
-          <w:b/>
-          <w:bCs/>
-        </w:rPr>
-      </w:pPr>
-      <w:r>
-        <w:rPr>
-          <w:b/>
-          <w:bCs/>
-        </w:rPr>
-        <w:t xml:space="preserve">4.3 </w:t>
-      </w:r>
-      <w:r>
-        <w:rPr>
-          <w:b/>
-          <w:bCs/>
-        </w:rPr>
-        <w:t>MS3 - SAT</w:t>
+      </w:pPr>
+      <w:r>
+        <w:t>4.3 MS3 – SAT (Site Acceptance Testing &amp; Commissioning)</w:t>
       </w:r>
     </w:p>
     <w:p>
       <w:pPr>
         <w:pStyle w:val="ListParagraph"/>
-        <w:rPr>
-          <w:rFonts w:ascii="Segoe UI" w:hAnsi="Segoe UI" w:eastAsia="Segoe UI" w:cs="Segoe UI"/>
-          <w:sz w:val="21"/>
-          <w:szCs w:val="21"/>
-        </w:rPr>
-      </w:pPr>
-      <w:r>
-        <w:t>V</w:t>
-      </w:r>
-      <w:r>
-        <w:t>alidation</w:t>
-      </w:r>
-      <w:r>
-        <w:t>/proof</w:t>
-      </w:r>
-      <w:r>
-        <w:t xml:space="preserve"> </w:t>
-      </w:r>
-      <w:r>
-        <w:t xml:space="preserve">that delivered services and </w:t>
-      </w:r>
-      <w:r>
-        <w:t>equipment</w:t>
-      </w:r>
-      <w:r>
-        <w:t xml:space="preserve"> meet Section 3 Requirements</w:t>
-      </w:r>
-      <w:r>
-        <w:t>.</w:t>
+      </w:pPr>
+      <w:r>
+        <w:t>Physical installation and commissioning of all equipment on site</w:t>
       </w:r>
     </w:p>
     <w:p>
@@ -2329,377 +2191,112 @@
         <w:pStyle w:val="ListParagraph"/>
       </w:pPr>
       <w:r>
-        <w:t>All equipment must be validated and ready for operational use prior to Go‑Live.</w:t>
+        <w:t>Connectivity and integration testing (network, power, and application layer)</w:t>
       </w:r>
     </w:p>
     <w:p>
       <w:pPr>
         <w:pStyle w:val="ListParagraph"/>
-        <w:numPr>
-          <w:ilvl w:val="0"/>
-          <w:numId w:val="0"/>
-        </w:numPr>
-        <w:ind w:left="720"/>
-      </w:pPr>
+      </w:pPr>
+      <w:r>
+        <w:t>Validation that all delivered equipment meets Section 3 requirements</w:t>
+      </w:r>
     </w:p>
     <w:p>
       <w:pPr>
-        <w:pStyle w:val="Heading3"/>
-        <w:spacing w:before="0" w:after="0"/>
-        <w:rPr>
-          <w:b/>
-          <w:bCs/>
-        </w:rPr>
-      </w:pPr>
-      <w:r>
-        <w:rPr>
-          <w:b/>
-          <w:bCs/>
-        </w:rPr>
-        <w:t xml:space="preserve">4.4 </w:t>
-      </w:r>
-      <w:r>
-        <w:rPr>
-          <w:b/>
-          <w:bCs/>
-        </w:rPr>
-        <w:t>MS4 - UAT</w:t>
+        <w:pStyle w:val="ListParagraph"/>
+      </w:pPr>
+      <w:r>
+        <w:t>All equipment must be validated and ready for operational use prior to Go-Live</w:t>
       </w:r>
     </w:p>
     <w:p>
       <w:pPr>
-        <w:pStyle w:val="ListParagraph"/>
-        <w:rPr>
-          <w:rFonts w:ascii="Segoe UI" w:hAnsi="Segoe UI" w:eastAsia="Segoe UI" w:cs="Segoe UI"/>
-          <w:sz w:val="21"/>
-          <w:szCs w:val="21"/>
-        </w:rPr>
-      </w:pPr>
-      <w:r>
-        <w:t>Asset inventory including</w:t>
-      </w:r>
-      <w:r>
-        <w:t xml:space="preserve"> </w:t>
-      </w:r>
-      <w:r>
-        <w:t>Device type</w:t>
-      </w:r>
-      <w:r>
-        <w:t xml:space="preserve">, </w:t>
-      </w:r>
-      <w:r>
-        <w:t>Model</w:t>
-      </w:r>
-      <w:r>
-        <w:t xml:space="preserve">, </w:t>
-      </w:r>
-      <w:r>
-        <w:t>Serial number</w:t>
-      </w:r>
-      <w:r>
-        <w:t>.</w:t>
+        <w:pStyle w:val="Heading3"/>
+      </w:pPr>
+      <w:r>
+        <w:t>4.4 MS4 – UAT (User Acceptance Testing)</w:t>
       </w:r>
     </w:p>
     <w:p>
       <w:pPr>
         <w:pStyle w:val="ListParagraph"/>
-        <w:rPr>
-          <w:rFonts w:ascii="Segoe UI" w:hAnsi="Segoe UI" w:eastAsia="Segoe UI" w:cs="Segoe UI"/>
-          <w:sz w:val="21"/>
-          <w:szCs w:val="21"/>
-        </w:rPr>
-      </w:pPr>
-      <w:r>
-        <w:t>Mapping of devices</w:t>
+      </w:pPr>
+      <w:r>
+        <w:t>Operations user acceptance testing</w:t>
       </w:r>
     </w:p>
     <w:p>
       <w:pPr>
         <w:pStyle w:val="ListParagraph"/>
-        <w:rPr>
-          <w:rFonts w:ascii="Segoe UI" w:hAnsi="Segoe UI" w:eastAsia="Segoe UI" w:cs="Segoe UI"/>
-          <w:sz w:val="21"/>
-          <w:szCs w:val="21"/>
-        </w:rPr>
-      </w:pPr>
-      <w:r>
-        <w:t xml:space="preserve">Handover of equipment to </w:t>
-      </w:r>
-      <w:r>
-        <w:t>Network team</w:t>
+      </w:pPr>
+      <w:r>
+        <w:t>Asset inventory including: Device type, Model, Serial number</w:t>
       </w:r>
     </w:p>
     <w:p>
       <w:pPr>
         <w:pStyle w:val="ListParagraph"/>
-        <w:rPr>
-          <w:rFonts w:ascii="Segoe UI" w:hAnsi="Segoe UI" w:eastAsia="Segoe UI" w:cs="Segoe UI"/>
-          <w:sz w:val="21"/>
-          <w:szCs w:val="21"/>
-        </w:rPr>
-      </w:pPr>
-      <w:r>
-        <w:t>Provision of support and escalation contacts</w:t>
+      </w:pPr>
+      <w:r>
+        <w:t>Mapping of devices to: Users, Stations, Rooms or operational areas</w:t>
       </w:r>
     </w:p>
     <w:p>
       <w:pPr>
-        <w:spacing w:after="0" w:line="240" w:lineRule="auto"/>
-        <w:rPr>
-          <w:rFonts w:ascii="Segoe UI" w:hAnsi="Segoe UI" w:eastAsia="Segoe UI" w:cs="Segoe UI"/>
-          <w:sz w:val="21"/>
-          <w:szCs w:val="21"/>
-        </w:rPr>
-      </w:pPr>
+        <w:pStyle w:val="ListParagraph"/>
+      </w:pPr>
+      <w:r>
+        <w:t>Handover of equipment to site management and operations team</w:t>
+      </w:r>
     </w:p>
     <w:p>
       <w:pPr>
-        <w:pStyle w:val="Heading3"/>
-        <w:spacing w:before="0" w:after="0"/>
-        <w:rPr>
-          <w:b/>
-          <w:bCs/>
-        </w:rPr>
-      </w:pPr>
-      <w:r>
-        <w:rPr>
-          <w:b/>
-          <w:bCs/>
-        </w:rPr>
-        <w:t>4.</w:t>
-      </w:r>
-      <w:r>
-        <w:rPr>
-          <w:b/>
-          <w:bCs/>
-        </w:rPr>
-        <w:t>5</w:t>
-      </w:r>
-      <w:r>
-        <w:rPr>
-          <w:b/>
-          <w:bCs/>
-        </w:rPr>
-        <w:t xml:space="preserve"> </w:t>
-      </w:r>
-      <w:r>
-        <w:rPr>
-          <w:b/>
-          <w:bCs/>
-        </w:rPr>
-        <w:t>MS5 - HYPERCARE</w:t>
+        <w:pStyle w:val="ListParagraph"/>
+      </w:pPr>
+      <w:r>
+        <w:t>Provision of support and escalation contacts</w:t>
       </w:r>
     </w:p>
     <w:p>
       <w:pPr>
-        <w:spacing w:after="0" w:line="240" w:lineRule="auto"/>
-        <w:rPr>
-          <w:rFonts w:ascii="Segoe UI" w:hAnsi="Segoe UI" w:eastAsia="Segoe UI" w:cs="Segoe UI"/>
-          <w:sz w:val="21"/>
-          <w:szCs w:val="21"/>
-        </w:rPr>
-      </w:pPr>
+        <w:pStyle w:val="Heading3"/>
+      </w:pPr>
+      <w:r>
+        <w:t>4.5 MS5 – Hypercare &amp; Project Closure</w:t>
+      </w:r>
     </w:p>
     <w:p>
       <w:pPr>
         <w:pStyle w:val="ListParagraph"/>
       </w:pPr>
       <w:r>
-        <w:t>Confirm NOC Monitoring and SLA reports</w:t>
+        <w:t>Hypercare support during initial operational period</w:t>
       </w:r>
     </w:p>
     <w:p>
       <w:pPr>
         <w:pStyle w:val="ListParagraph"/>
-        <w:rPr>
-          <w:rFonts w:ascii="Segoe UI" w:hAnsi="Segoe UI" w:eastAsia="Segoe UI" w:cs="Segoe UI"/>
-          <w:sz w:val="21"/>
-          <w:szCs w:val="21"/>
-        </w:rPr>
-      </w:pPr>
-      <w:r>
-        <w:t>Provision of support and escalation contacts</w:t>
+      </w:pPr>
+      <w:r>
+        <w:t>Confirm NOC monitoring and SLA reports (where applicable)</w:t>
       </w:r>
     </w:p>
     <w:p>
       <w:pPr>
         <w:pStyle w:val="ListParagraph"/>
-        <w:numPr>
-          <w:ilvl w:val="0"/>
-          <w:numId w:val="0"/>
-        </w:numPr>
-        <w:ind w:left="720"/>
-      </w:pPr>
+      </w:pPr>
+      <w:r>
+        <w:t>Validate all documentation required for handover to support is complete</w:t>
+      </w:r>
     </w:p>
     <w:p>
       <w:pPr>
         <w:pStyle w:val="ListParagraph"/>
-        <w:numPr>
-          <w:ilvl w:val="0"/>
-          <w:numId w:val="0"/>
-        </w:numPr>
-        <w:ind w:left="720"/>
-      </w:pPr>
-    </w:p>
-    <w:p>
-      <w:pPr>
-        <w:spacing w:after="0" w:line="240" w:lineRule="auto"/>
-        <w:rPr>
-          <w:rFonts w:ascii="Segoe UI" w:hAnsi="Segoe UI" w:eastAsia="Segoe UI" w:cs="Segoe UI"/>
-          <w:sz w:val="21"/>
-          <w:szCs w:val="21"/>
-        </w:rPr>
-      </w:pPr>
-    </w:p>
-    <w:p>
-      <w:pPr>
-        <w:spacing w:after="0" w:line="240" w:lineRule="auto"/>
-        <w:rPr>
-          <w:rFonts w:ascii="Segoe UI" w:hAnsi="Segoe UI" w:eastAsia="Segoe UI" w:cs="Segoe UI"/>
-          <w:sz w:val="21"/>
-          <w:szCs w:val="21"/>
-        </w:rPr>
-      </w:pPr>
-    </w:p>
-    <w:p>
-      <w:pPr>
-        <w:spacing w:after="0" w:line="240" w:lineRule="auto"/>
-        <w:rPr>
-          <w:rFonts w:ascii="Segoe UI" w:hAnsi="Segoe UI" w:eastAsia="Segoe UI" w:cs="Segoe UI"/>
-          <w:sz w:val="21"/>
-          <w:szCs w:val="21"/>
-        </w:rPr>
-      </w:pPr>
-    </w:p>
-    <w:p>
-      <w:pPr>
-        <w:spacing w:after="0" w:line="240" w:lineRule="auto"/>
-        <w:rPr>
-          <w:rFonts w:ascii="Segoe UI" w:hAnsi="Segoe UI" w:eastAsia="Segoe UI" w:cs="Segoe UI"/>
-          <w:sz w:val="21"/>
-          <w:szCs w:val="21"/>
-        </w:rPr>
-      </w:pPr>
-    </w:p>
-    <w:p>
-      <w:pPr>
-        <w:spacing w:after="0" w:line="240" w:lineRule="auto"/>
-        <w:rPr>
-          <w:rFonts w:ascii="Segoe UI" w:hAnsi="Segoe UI" w:eastAsia="Segoe UI" w:cs="Segoe UI"/>
-          <w:sz w:val="21"/>
-          <w:szCs w:val="21"/>
-        </w:rPr>
-      </w:pPr>
-    </w:p>
-    <w:p>
-      <w:pPr>
-        <w:spacing w:after="0" w:line="240" w:lineRule="auto"/>
-        <w:rPr>
-          <w:rFonts w:ascii="Segoe UI" w:hAnsi="Segoe UI" w:eastAsia="Segoe UI" w:cs="Segoe UI"/>
-          <w:sz w:val="21"/>
-          <w:szCs w:val="21"/>
-        </w:rPr>
-      </w:pPr>
-    </w:p>
-    <w:p>
-      <w:pPr>
-        <w:spacing w:after="0" w:line="240" w:lineRule="auto"/>
-        <w:rPr>
-          <w:rFonts w:ascii="Segoe UI" w:hAnsi="Segoe UI" w:eastAsia="Segoe UI" w:cs="Segoe UI"/>
-          <w:sz w:val="21"/>
-          <w:szCs w:val="21"/>
-        </w:rPr>
-      </w:pPr>
-    </w:p>
-    <w:p>
-      <w:pPr>
-        <w:spacing w:after="0" w:line="240" w:lineRule="auto"/>
-        <w:rPr>
-          <w:rFonts w:ascii="Segoe UI" w:hAnsi="Segoe UI" w:eastAsia="Segoe UI" w:cs="Segoe UI"/>
-          <w:sz w:val="21"/>
-          <w:szCs w:val="21"/>
-        </w:rPr>
-      </w:pPr>
-    </w:p>
-    <w:p>
-      <w:pPr>
-        <w:spacing w:after="0" w:line="240" w:lineRule="auto"/>
-        <w:rPr>
-          <w:rFonts w:ascii="Segoe UI" w:hAnsi="Segoe UI" w:eastAsia="Segoe UI" w:cs="Segoe UI"/>
-          <w:sz w:val="21"/>
-          <w:szCs w:val="21"/>
-        </w:rPr>
-      </w:pPr>
-    </w:p>
-    <w:p>
-      <w:pPr>
-        <w:spacing w:after="0" w:line="240" w:lineRule="auto"/>
-        <w:rPr>
-          <w:rFonts w:ascii="Segoe UI" w:hAnsi="Segoe UI" w:eastAsia="Segoe UI" w:cs="Segoe UI"/>
-          <w:sz w:val="21"/>
-          <w:szCs w:val="21"/>
-        </w:rPr>
-      </w:pPr>
-    </w:p>
-    <w:p>
-      <w:pPr>
-        <w:spacing w:after="0" w:line="240" w:lineRule="auto"/>
-        <w:rPr>
-          <w:rFonts w:ascii="Segoe UI" w:hAnsi="Segoe UI" w:eastAsia="Segoe UI" w:cs="Segoe UI"/>
-          <w:sz w:val="21"/>
-          <w:szCs w:val="21"/>
-        </w:rPr>
-      </w:pPr>
-    </w:p>
-    <w:p>
-      <w:pPr>
-        <w:spacing w:after="0" w:line="240" w:lineRule="auto"/>
-        <w:rPr>
-          <w:rFonts w:ascii="Segoe UI" w:hAnsi="Segoe UI" w:eastAsia="Segoe UI" w:cs="Segoe UI"/>
-          <w:sz w:val="21"/>
-          <w:szCs w:val="21"/>
-        </w:rPr>
-      </w:pPr>
-    </w:p>
-    <w:p>
-      <w:pPr>
-        <w:spacing w:after="0" w:line="240" w:lineRule="auto"/>
-        <w:rPr>
-          <w:rFonts w:ascii="Segoe UI" w:hAnsi="Segoe UI" w:eastAsia="Segoe UI" w:cs="Segoe UI"/>
-          <w:sz w:val="21"/>
-          <w:szCs w:val="21"/>
-        </w:rPr>
-      </w:pPr>
-    </w:p>
-    <w:p>
-      <w:pPr>
-        <w:spacing w:after="0" w:line="240" w:lineRule="auto"/>
-        <w:rPr>
-          <w:rFonts w:ascii="Segoe UI" w:hAnsi="Segoe UI" w:eastAsia="Segoe UI" w:cs="Segoe UI"/>
-          <w:sz w:val="21"/>
-          <w:szCs w:val="21"/>
-        </w:rPr>
-      </w:pPr>
-    </w:p>
-    <w:p>
-      <w:pPr>
-        <w:spacing w:after="0" w:line="240" w:lineRule="auto"/>
-        <w:rPr>
-          <w:rFonts w:ascii="Segoe UI" w:hAnsi="Segoe UI" w:eastAsia="Segoe UI" w:cs="Segoe UI"/>
-          <w:sz w:val="21"/>
-          <w:szCs w:val="21"/>
-        </w:rPr>
-      </w:pPr>
-    </w:p>
-    <w:p>
-      <w:pPr>
-        <w:spacing w:after="0" w:line="240" w:lineRule="auto"/>
-        <w:rPr>
-          <w:rFonts w:ascii="Segoe UI" w:hAnsi="Segoe UI" w:eastAsia="Segoe UI" w:cs="Segoe UI"/>
-          <w:sz w:val="21"/>
-          <w:szCs w:val="21"/>
-        </w:rPr>
-      </w:pPr>
+      </w:pPr>
+      <w:r>
+        <w:t>Final project acceptance sign-off and closure</w:t>
+      </w:r>
     </w:p>
     <w:p>
       <w:pPr>

</xml_diff>